<commit_message>
65) Proyecto 1 Sitio Web/CMS LAESH deploy Producción en hostinger VM con dominio laesh.mx. Scripts setup reproducibles. Todo proyecto 1 al 93%, Falta: Estabilizar Fichas de promosiones cms, PA laesh, Publicar en SEO Google search, Deploy en ambiente pruebas Caelitandem. Ya todos los features de alcance incluidos (cms: Facebook no jalara). Falta de optimizar lo del cache v?=time, swole, opcache, rte letras y tamaños. ToDo: Pruebas aleatorias/estabilización. Avance en Block digital al:70%.
</commit_message>
<xml_diff>
--- a/portafolio-dev-2026/blocklabgd/v1.2/contrato/Anexo_A_Bloc_Digital_v4.docx
+++ b/portafolio-dev-2026/blocklabgd/v1.2/contrato/Anexo_A_Bloc_Digital_v4.docx
@@ -530,6 +530,108 @@
     <w:p>
       <w:pPr>
         <w:pStyle w:val="BodyText"/>
+        <w:numPr>
+          <w:ilvl w:val="0"/>
+          <w:numId w:val="2"/>
+        </w:numPr>
+        <w:tabs>
+          <w:tab w:val="clear" w:pos="1134"/>
+          <w:tab w:val="left" w:pos="709" w:leader="none"/>
+        </w:tabs>
+        <w:bidi w:val="0"/>
+        <w:ind w:hanging="283" w:start="709"/>
+        <w:rPr/>
+      </w:pPr>
+      <w:r>
+        <w:rPr>
+          <w:rStyle w:val="Strong"/>
+        </w:rPr>
+        <w:t>Características Adicionales (Resultantes de Revisiones de Maqueta):</w:t>
+      </w:r>
+    </w:p>
+    <w:p>
+      <w:pPr>
+        <w:pStyle w:val="BodyText"/>
+        <w:numPr>
+          <w:ilvl w:val="1"/>
+          <w:numId w:val="2"/>
+        </w:numPr>
+        <w:tabs>
+          <w:tab w:val="clear" w:pos="1134"/>
+          <w:tab w:val="left" w:pos="1418" w:leader="none"/>
+        </w:tabs>
+        <w:bidi w:val="0"/>
+        <w:spacing w:before="0" w:after="0"/>
+        <w:ind w:hanging="283" w:start="1418"/>
+        <w:rPr/>
+      </w:pPr>
+      <w:r>
+        <w:rPr>
+          <w:rStyle w:val="Strong"/>
+        </w:rPr>
+        <w:t>Fuente Única de Catálogo (SSOT):</w:t>
+      </w:r>
+      <w:r>
+        <w:rPr/>
+        <w:t xml:space="preserve"> Centralización del catálogo de estudios clínicos administrables en un solo lugar para alimentar de forma unificada tanto al Sitio Web como al Bloc Digital. </w:t>
+      </w:r>
+    </w:p>
+    <w:p>
+      <w:pPr>
+        <w:pStyle w:val="BodyText"/>
+        <w:numPr>
+          <w:ilvl w:val="1"/>
+          <w:numId w:val="2"/>
+        </w:numPr>
+        <w:tabs>
+          <w:tab w:val="clear" w:pos="1134"/>
+          <w:tab w:val="left" w:pos="1418" w:leader="none"/>
+        </w:tabs>
+        <w:bidi w:val="0"/>
+        <w:spacing w:before="0" w:after="0"/>
+        <w:ind w:hanging="283" w:start="1418"/>
+        <w:rPr/>
+      </w:pPr>
+      <w:r>
+        <w:rPr>
+          <w:rStyle w:val="Strong"/>
+        </w:rPr>
+        <w:t>Búsqueda Autocompletada:</w:t>
+      </w:r>
+      <w:r>
+        <w:rPr/>
+        <w:t xml:space="preserve"> En el formulario de Orden digital se tendrá la opción de búsqueda de estudio con input-text de autocompletado. </w:t>
+      </w:r>
+    </w:p>
+    <w:p>
+      <w:pPr>
+        <w:pStyle w:val="BodyText"/>
+        <w:numPr>
+          <w:ilvl w:val="1"/>
+          <w:numId w:val="2"/>
+        </w:numPr>
+        <w:tabs>
+          <w:tab w:val="clear" w:pos="1134"/>
+          <w:tab w:val="left" w:pos="1418" w:leader="none"/>
+        </w:tabs>
+        <w:bidi w:val="0"/>
+        <w:ind w:hanging="283" w:start="1418"/>
+        <w:rPr/>
+      </w:pPr>
+      <w:r>
+        <w:rPr>
+          <w:rStyle w:val="Strong"/>
+        </w:rPr>
+        <w:t>Catálogos ABC y Seguridad Ampliada:</w:t>
+      </w:r>
+      <w:r>
+        <w:rPr/>
+        <w:t xml:space="preserve"> ABC para catálogos de Universidades y Lugares de trabajo, además de Reseteo y cambio de contraseña directo por usuario y por Laesh Admin. </w:t>
+      </w:r>
+    </w:p>
+    <w:p>
+      <w:pPr>
+        <w:pStyle w:val="BodyText"/>
         <w:bidi w:val="0"/>
         <w:spacing w:before="0" w:after="283"/>
         <w:jc w:val="both"/>
@@ -704,7 +806,27 @@
       </w:r>
       <w:r>
         <w:rPr/>
-        <w:t xml:space="preserve"> para el desarrollo, despliegue en servidor de producción e inicio del Periodo de Estabilización.</w:t>
+        <w:t xml:space="preserve"> para el desarrollo, despliegue en servidor de producción e inicio del Periodo de Estabilización. La fecha de inicio es el </w:t>
+      </w:r>
+      <w:r>
+        <w:rPr>
+          <w:rStyle w:val="Strong"/>
+        </w:rPr>
+        <w:t>15 de Septiembre de 2026</w:t>
+      </w:r>
+      <w:r>
+        <w:rPr/>
+        <w:t xml:space="preserve"> y la fecha final proyectada es el </w:t>
+      </w:r>
+      <w:r>
+        <w:rPr>
+          <w:rStyle w:val="Strong"/>
+        </w:rPr>
+        <w:t>14 de Noviembre de 2026</w:t>
+      </w:r>
+      <w:r>
+        <w:rPr/>
+        <w:t>, con la precisión de que la fecha de terminación podría ser antes.</w:t>
       </w:r>
     </w:p>
     <w:p>
@@ -802,13 +924,13 @@
       </w:r>
       <w:r>
         <w:rPr/>
-        <w:t xml:space="preserve"> El costo total del desarrollo es de </w:t>
-      </w:r>
-      <w:r>
-        <w:rPr>
-          <w:rStyle w:val="Strong"/>
-        </w:rPr>
-        <w:t>$33,000.00 MXN (Netos)</w:t>
+        <w:t xml:space="preserve"> El costo base del desarrollo es de $33,000.00 MXN, sumado al importe de $3,000.00 MXN (Netos) correspondientes a las 3 características adicionales solicitadas en revisiones de maqueta, lo que da un total del proyecto de </w:t>
+      </w:r>
+      <w:r>
+        <w:rPr>
+          <w:rStyle w:val="Strong"/>
+        </w:rPr>
+        <w:t>$36,000.00 MXN (Netos)</w:t>
       </w:r>
       <w:r>
         <w:rPr/>
@@ -986,7 +1108,7 @@
             </w:pPr>
             <w:r>
               <w:rPr/>
-              <w:t>$13,200.00 MXN (Netos)</w:t>
+              <w:t>$14,400.00 MXN (Netos)</w:t>
             </w:r>
           </w:p>
         </w:tc>
@@ -1075,7 +1197,7 @@
             </w:pPr>
             <w:r>
               <w:rPr/>
-              <w:t>$19,800.00 MXN (Netos)</w:t>
+              <w:t>$21,600.00 MXN (Netos)</w:t>
             </w:r>
           </w:p>
         </w:tc>
@@ -1344,8 +1466,8 @@
     </w:lvl>
     <w:lvl w:ilvl="1">
       <w:start w:val="1"/>
-      <w:numFmt w:val="bullet"/>
-      <w:lvlText w:val=""/>
+      <w:numFmt w:val="decimal"/>
+      <w:lvlText w:val="%2."/>
       <w:lvlJc w:val="start"/>
       <w:pPr>
         <w:tabs>
@@ -1353,14 +1475,12 @@
         </w:tabs>
         <w:ind w:start="1418" w:hanging="283"/>
       </w:pPr>
-      <w:rPr>
-        <w:rFonts w:ascii="Symbol" w:hAnsi="Symbol" w:cs="Symbol" w:hint="default"/>
-      </w:rPr>
+      <w:rPr/>
     </w:lvl>
     <w:lvl w:ilvl="2">
       <w:start w:val="1"/>
-      <w:numFmt w:val="bullet"/>
-      <w:lvlText w:val=""/>
+      <w:numFmt w:val="decimal"/>
+      <w:lvlText w:val="%3."/>
       <w:lvlJc w:val="start"/>
       <w:pPr>
         <w:tabs>
@@ -1368,14 +1488,12 @@
         </w:tabs>
         <w:ind w:start="2127" w:hanging="283"/>
       </w:pPr>
-      <w:rPr>
-        <w:rFonts w:ascii="Symbol" w:hAnsi="Symbol" w:cs="Symbol" w:hint="default"/>
-      </w:rPr>
+      <w:rPr/>
     </w:lvl>
     <w:lvl w:ilvl="3">
       <w:start w:val="1"/>
-      <w:numFmt w:val="bullet"/>
-      <w:lvlText w:val=""/>
+      <w:numFmt w:val="decimal"/>
+      <w:lvlText w:val="%4."/>
       <w:lvlJc w:val="start"/>
       <w:pPr>
         <w:tabs>
@@ -1383,14 +1501,12 @@
         </w:tabs>
         <w:ind w:start="2836" w:hanging="283"/>
       </w:pPr>
-      <w:rPr>
-        <w:rFonts w:ascii="Symbol" w:hAnsi="Symbol" w:cs="Symbol" w:hint="default"/>
-      </w:rPr>
+      <w:rPr/>
     </w:lvl>
     <w:lvl w:ilvl="4">
       <w:start w:val="1"/>
-      <w:numFmt w:val="bullet"/>
-      <w:lvlText w:val=""/>
+      <w:numFmt w:val="decimal"/>
+      <w:lvlText w:val="%5."/>
       <w:lvlJc w:val="start"/>
       <w:pPr>
         <w:tabs>
@@ -1398,14 +1514,12 @@
         </w:tabs>
         <w:ind w:start="3545" w:hanging="283"/>
       </w:pPr>
-      <w:rPr>
-        <w:rFonts w:ascii="Symbol" w:hAnsi="Symbol" w:cs="Symbol" w:hint="default"/>
-      </w:rPr>
+      <w:rPr/>
     </w:lvl>
     <w:lvl w:ilvl="5">
       <w:start w:val="1"/>
-      <w:numFmt w:val="bullet"/>
-      <w:lvlText w:val=""/>
+      <w:numFmt w:val="decimal"/>
+      <w:lvlText w:val="%6."/>
       <w:lvlJc w:val="start"/>
       <w:pPr>
         <w:tabs>
@@ -1413,14 +1527,12 @@
         </w:tabs>
         <w:ind w:start="4254" w:hanging="283"/>
       </w:pPr>
-      <w:rPr>
-        <w:rFonts w:ascii="Symbol" w:hAnsi="Symbol" w:cs="Symbol" w:hint="default"/>
-      </w:rPr>
+      <w:rPr/>
     </w:lvl>
     <w:lvl w:ilvl="6">
       <w:start w:val="1"/>
-      <w:numFmt w:val="bullet"/>
-      <w:lvlText w:val=""/>
+      <w:numFmt w:val="decimal"/>
+      <w:lvlText w:val="%7."/>
       <w:lvlJc w:val="start"/>
       <w:pPr>
         <w:tabs>
@@ -1428,14 +1540,12 @@
         </w:tabs>
         <w:ind w:start="4963" w:hanging="283"/>
       </w:pPr>
-      <w:rPr>
-        <w:rFonts w:ascii="Symbol" w:hAnsi="Symbol" w:cs="Symbol" w:hint="default"/>
-      </w:rPr>
+      <w:rPr/>
     </w:lvl>
     <w:lvl w:ilvl="7">
       <w:start w:val="1"/>
-      <w:numFmt w:val="bullet"/>
-      <w:lvlText w:val=""/>
+      <w:numFmt w:val="decimal"/>
+      <w:lvlText w:val="%8."/>
       <w:lvlJc w:val="start"/>
       <w:pPr>
         <w:tabs>
@@ -1443,14 +1553,12 @@
         </w:tabs>
         <w:ind w:start="5672" w:hanging="283"/>
       </w:pPr>
-      <w:rPr>
-        <w:rFonts w:ascii="Symbol" w:hAnsi="Symbol" w:cs="Symbol" w:hint="default"/>
-      </w:rPr>
+      <w:rPr/>
     </w:lvl>
     <w:lvl w:ilvl="8">
       <w:start w:val="1"/>
-      <w:numFmt w:val="bullet"/>
-      <w:lvlText w:val=""/>
+      <w:numFmt w:val="decimal"/>
+      <w:lvlText w:val="%9."/>
       <w:lvlJc w:val="start"/>
       <w:pPr>
         <w:tabs>
@@ -1458,9 +1566,7 @@
         </w:tabs>
         <w:ind w:start="6381" w:hanging="283"/>
       </w:pPr>
-      <w:rPr>
-        <w:rFonts w:ascii="Symbol" w:hAnsi="Symbol" w:cs="Symbol" w:hint="default"/>
-      </w:rPr>
+      <w:rPr/>
     </w:lvl>
   </w:abstractNum>
   <w:abstractNum w:abstractNumId="3">
@@ -1919,6 +2025,11 @@
     <w:rPr>
       <w:rFonts w:ascii="OpenSymbol" w:hAnsi="OpenSymbol" w:eastAsia="OpenSymbol" w:cs="OpenSymbol"/>
     </w:rPr>
+  </w:style>
+  <w:style w:type="character" w:styleId="NumberingSymbols">
+    <w:name w:val="Numbering Symbols"/>
+    <w:qFormat/>
+    <w:rPr/>
   </w:style>
   <w:style w:type="character" w:styleId="FollowedHyperlink">
     <w:name w:val="FollowedHyperlink"/>

</xml_diff>